<commit_message>
update mededelingen template static information
</commit_message>
<xml_diff>
--- a/doc_templates/mededelingen_template.docx
+++ b/doc_templates/mededelingen_template.docx
@@ -1,6 +1,6 @@
 
 <file path=word/document.xml><?xml version="1.0" encoding="utf-8"?>
-<w:document xmlns:wpc="http://schemas.microsoft.com/office/word/2010/wordprocessingCanvas" xmlns:cx="http://schemas.microsoft.com/office/drawing/2014/chartex" xmlns:cx1="http://schemas.microsoft.com/office/drawing/2015/9/8/chartex" xmlns:cx2="http://schemas.microsoft.com/office/drawing/2015/10/21/chartex" xmlns:cx3="http://schemas.microsoft.com/office/drawing/2016/5/9/chartex" xmlns:cx4="http://schemas.microsoft.com/office/drawing/2016/5/10/chartex" xmlns:cx5="http://schemas.microsoft.com/office/drawing/2016/5/11/chartex" xmlns:cx6="http://schemas.microsoft.com/office/drawing/2016/5/12/chartex" xmlns:cx7="http://schemas.microsoft.com/office/drawing/2016/5/13/chartex" xmlns:cx8="http://schemas.microsoft.com/office/drawing/2016/5/14/chartex" xmlns:mc="http://schemas.openxmlformats.org/markup-compatibility/2006" xmlns:aink="http://schemas.microsoft.com/office/drawing/2016/ink" xmlns:am3d="http://schemas.microsoft.com/office/drawing/2017/model3d" xmlns:o="urn:schemas-microsoft-com:office:office" xmlns:oel="http://schemas.microsoft.com/office/2019/extlst" xmlns:r="http://schemas.openxmlformats.org/officeDocument/2006/relationships" xmlns:m="http://schemas.openxmlformats.org/officeDocument/2006/math" xmlns:v="urn:schemas-microsoft-com:vml" xmlns:wp14="http://schemas.microsoft.com/office/word/2010/wordprocessingDrawing" xmlns:wp="http://schemas.openxmlformats.org/drawingml/2006/wordprocessingDrawing" xmlns:w10="urn:schemas-microsoft-com:office:word" xmlns:w="http://schemas.openxmlformats.org/wordprocessingml/2006/main" xmlns:w14="http://schemas.microsoft.com/office/word/2010/wordml" xmlns:w15="http://schemas.microsoft.com/office/word/2012/wordml" xmlns:w16cex="http://schemas.microsoft.com/office/word/2018/wordml/cex" xmlns:w16cid="http://schemas.microsoft.com/office/word/2016/wordml/cid" xmlns:w16="http://schemas.microsoft.com/office/word/2018/wordml" xmlns:w16du="http://schemas.microsoft.com/office/word/2023/wordml/word16du" xmlns:w16sdtdh="http://schemas.microsoft.com/office/word/2020/wordml/sdtdatahash" xmlns:w16sdtfl="http://schemas.microsoft.com/office/word/2024/wordml/sdtformatlock" xmlns:w16se="http://schemas.microsoft.com/office/word/2015/wordml/symex" xmlns:wpg="http://schemas.microsoft.com/office/word/2010/wordprocessingGroup" xmlns:wpi="http://schemas.microsoft.com/office/word/2010/wordprocessingInk" xmlns:wne="http://schemas.microsoft.com/office/word/2006/wordml" xmlns:wps="http://schemas.microsoft.com/office/word/2010/wordprocessingShape" mc:Ignorable="w14 w15 w16se w16cid w16 w16cex w16sdtdh w16sdtfl w16du wp14">
+<w:document xmlns:wpc="http://schemas.microsoft.com/office/word/2010/wordprocessingCanvas" xmlns:cx="http://schemas.microsoft.com/office/drawing/2014/chartex" xmlns:cx1="http://schemas.microsoft.com/office/drawing/2015/9/8/chartex" xmlns:cx2="http://schemas.microsoft.com/office/drawing/2015/10/21/chartex" xmlns:cx3="http://schemas.microsoft.com/office/drawing/2016/5/9/chartex" xmlns:cx4="http://schemas.microsoft.com/office/drawing/2016/5/10/chartex" xmlns:cx5="http://schemas.microsoft.com/office/drawing/2016/5/11/chartex" xmlns:cx6="http://schemas.microsoft.com/office/drawing/2016/5/12/chartex" xmlns:cx7="http://schemas.microsoft.com/office/drawing/2016/5/13/chartex" xmlns:cx8="http://schemas.microsoft.com/office/drawing/2016/5/14/chartex" xmlns:mc="http://schemas.openxmlformats.org/markup-compatibility/2006" xmlns:m="http://schemas.openxmlformats.org/officeDocument/2006/math" xmlns:aink="http://schemas.microsoft.com/office/drawing/2016/ink" xmlns:am3d="http://schemas.microsoft.com/office/drawing/2017/model3d" xmlns:oel="http://schemas.microsoft.com/office/2019/extlst" xmlns:r="http://schemas.openxmlformats.org/officeDocument/2006/relationships" xmlns:wp14="http://schemas.microsoft.com/office/word/2010/wordprocessingDrawing" xmlns:wp="http://schemas.openxmlformats.org/drawingml/2006/wordprocessingDrawing" xmlns:wpg="http://schemas.microsoft.com/office/word/2010/wordprocessingGroup" xmlns:wpi="http://schemas.microsoft.com/office/word/2010/wordprocessingInk" xmlns:wps="http://schemas.microsoft.com/office/word/2010/wordprocessingShape" xmlns:o="urn:schemas-microsoft-com:office:office" xmlns:v="urn:schemas-microsoft-com:vml" xmlns:w10="urn:schemas-microsoft-com:office:word" xmlns:w="http://schemas.openxmlformats.org/wordprocessingml/2006/main" xmlns:w14="http://schemas.microsoft.com/office/word/2010/wordml" xmlns:w15="http://schemas.microsoft.com/office/word/2012/wordml" xmlns:w16cex="http://schemas.microsoft.com/office/word/2018/wordml/cex" xmlns:w16cid="http://schemas.microsoft.com/office/word/2016/wordml/cid" xmlns:w16="http://schemas.microsoft.com/office/word/2018/wordml" xmlns:w16sdtdh="http://schemas.microsoft.com/office/word/2020/wordml/sdtdatahash" xmlns:w16sdtfl="http://schemas.microsoft.com/office/word/2024/wordml/sdtformatlock" xmlns:w16se="http://schemas.microsoft.com/office/word/2015/wordml/symex" xmlns:w16du="http://schemas.microsoft.com/office/word/2023/wordml/word16du" xmlns:wne="http://schemas.microsoft.com/office/word/2006/wordml" mc:Ignorable="w14 w15 w16se w16cid w16 w16cex w16sdtdh w16sdtfl w16du wp14">
   <w:body>
     <w:p>
       <w:pPr>
@@ -1102,7 +1102,7 @@
           <w:noProof/>
         </w:rPr>
         <w:drawing>
-          <wp:inline distT="0" distB="0" distL="0" distR="0" wp14:anchorId="463B1E06" wp14:editId="2586A1E4">
+          <wp:inline distT="0" distB="0" distL="0" distR="0" wp14:anchorId="463B1E06" wp14:editId="0E6B0249">
             <wp:extent cx="1111169" cy="1111169"/>
             <wp:effectExtent l="0" t="0" r="0" b="0"/>
             <wp:docPr id="211357190" name="Picture 2" descr="Tikkie QRCode Collecte 10-5-2026.png"/>
@@ -1351,249 +1351,369 @@
         <w:fldChar w:fldCharType="separate"/>
       </w:r>
       <w:r>
-        <w:t>"Overlijdensbericht</w:t>
-      </w:r>
-    </w:p>
-    <w:p>
-      <w:r>
-        <w:t xml:space="preserve">Op zondag 3 mei 2026 is op 81-jarige leeftijd in Tangerang, Indonesia overleden, mevr. Meike Charlotte </w:t>
+        <w:t>"Gemeente Bidstond</w:t>
+      </w:r>
+    </w:p>
+    <w:p>
+      <w:r>
+        <w:t xml:space="preserve">De volgende Gemeente Bidstond, via Zoom, wordt gehouden op DV zaterdag 4 juli 2026 van 10:00 tot 12:00, o.l.v. ds. Daniel K. </w:t>
       </w:r>
       <w:proofErr w:type="spellStart"/>
       <w:r>
-        <w:t>Rosalin</w:t>
+        <w:t>Listijabudi</w:t>
       </w:r>
       <w:proofErr w:type="spellEnd"/>
+    </w:p>
+    <w:p>
+      <w:r>
+        <w:rPr>
+          <w:lang w:val="en-US"/>
+        </w:rPr>
+        <w:t xml:space="preserve">Het thema is Be Perfect, therefore </w:t>
+      </w:r>
+      <w:proofErr w:type="gramStart"/>
+      <w:r>
+        <w:rPr>
+          <w:lang w:val="en-US"/>
+        </w:rPr>
+        <w:t>As</w:t>
+      </w:r>
+      <w:proofErr w:type="gramEnd"/>
+      <w:r>
+        <w:rPr>
+          <w:lang w:val="en-US"/>
+        </w:rPr>
+        <w:t xml:space="preserve"> your Heavenly Father is perfect. </w:t>
+      </w:r>
+      <w:r>
+        <w:t>Zoom-link: https://us02web.zoom.us/launch/jc/81827504627</w:t>
+      </w:r>
+    </w:p>
+    <w:p>
+      <w:r>
+        <w:t>Meeting ID: 818 2750 4627</w:t>
+      </w:r>
+    </w:p>
+    <w:p>
+      <w:r>
+        <w:t>Passcode: 419220</w:t>
+      </w:r>
+    </w:p>
+    <w:p/>
+    <w:p>
+      <w:r>
+        <w:t>Voordracht kandidaat-ouderlingen</w:t>
+      </w:r>
+    </w:p>
+    <w:p>
+      <w:r>
+        <w:t>Met het oog op de toekomstige behoefte aan nieuwe ouderlingen binnen onze gemeente, nodigt de kerkenraad gemeenteleden uit om namen van geschikte broeders of zusters vertrouwelijk voor te dragen via het voordrachtformulier. Het formulier is verkrijgbaar bij de secretaris van de kerkenraad. Wij vragen u dit biddend te overwegen.</w:t>
+      </w:r>
+    </w:p>
+    <w:p/>
+    <w:p>
+      <w:r>
+        <w:t>Huwelijksinzegening</w:t>
+      </w:r>
+    </w:p>
+    <w:p>
+      <w:r>
+        <w:t xml:space="preserve">Op dv zaterdag 4 juli </w:t>
+      </w:r>
+      <w:proofErr w:type="gramStart"/>
+      <w:r>
+        <w:t>2026,  zullen</w:t>
+      </w:r>
+      <w:proofErr w:type="gramEnd"/>
+      <w:r>
+        <w:t xml:space="preserve"> br. Martijn Otto </w:t>
+      </w:r>
+      <w:proofErr w:type="spellStart"/>
+      <w:r>
+        <w:t>Overakker</w:t>
+      </w:r>
+      <w:proofErr w:type="spellEnd"/>
+      <w:r>
+        <w:t xml:space="preserve"> en zr. </w:t>
+      </w:r>
+      <w:proofErr w:type="spellStart"/>
+      <w:r>
+        <w:t>Luky</w:t>
+      </w:r>
+      <w:proofErr w:type="spellEnd"/>
       <w:r>
         <w:t xml:space="preserve"> </w:t>
       </w:r>
       <w:proofErr w:type="spellStart"/>
       <w:r>
-        <w:t>Soukotta</w:t>
+        <w:t>Ayudya</w:t>
       </w:r>
       <w:proofErr w:type="spellEnd"/>
       <w:r>
-        <w:t>-Frederik.</w:t>
-      </w:r>
-    </w:p>
-    <w:p>
-      <w:r>
-        <w:t xml:space="preserve">Zij was de moeder van zr. Elizabeth </w:t>
+        <w:t xml:space="preserve"> Danianti de huwelijksinzegening ontvangen in GKI </w:t>
       </w:r>
       <w:proofErr w:type="spellStart"/>
       <w:r>
-        <w:t>Soukotta</w:t>
+        <w:t>Gejayan</w:t>
       </w:r>
       <w:proofErr w:type="spellEnd"/>
       <w:r>
-        <w:t xml:space="preserve"> en schoonmoeder van br. Bandung </w:t>
+        <w:t xml:space="preserve"> Yogyakarta, Indonesia. Br. Martijn en zr. </w:t>
       </w:r>
       <w:proofErr w:type="spellStart"/>
       <w:r>
-        <w:t>Nasserie</w:t>
+        <w:t>Luky</w:t>
       </w:r>
       <w:proofErr w:type="spellEnd"/>
       <w:r>
-        <w:t xml:space="preserve"> van GKIN Amstelveen.</w:t>
-      </w:r>
-    </w:p>
-    <w:p>
-      <w:r>
-        <w:t>De gemeente en de kerkenraad bidden de familie in rouw Gods troost en nabijheid toe.</w:t>
+        <w:t xml:space="preserve"> zijn leden van de regio Amstelveen. Gaarne uw voorbede. </w:t>
       </w:r>
     </w:p>
     <w:p/>
     <w:p>
       <w:r>
+        <w:t>Boekenverkoop - Basispastoraat Toerusting</w:t>
+      </w:r>
+    </w:p>
+    <w:p>
+      <w:r>
+        <w:t>Tijdens de Basispastoraat Toerusting vorige week waren enkele boeken van br. Bud Gruwel op de tafel beschikbaar gesteld. De prijs van de boeken was hierbij niet duidelijk vermeld.</w:t>
+      </w:r>
+    </w:p>
+    <w:p>
+      <w:proofErr w:type="gramStart"/>
+      <w:r>
+        <w:t>Indien</w:t>
+      </w:r>
+      <w:proofErr w:type="gramEnd"/>
+      <w:r>
+        <w:t xml:space="preserve"> u een boek heeft meegenomen, verzoeken wij u vriendelijk om het terug te brengen, of contact op te nemen met de kerkenraad om de betaling te regelen.</w:t>
+      </w:r>
+    </w:p>
+    <w:p>
+      <w:r>
+        <w:t>Hartelijk dank voor uw begrip en medewerking.</w:t>
+      </w:r>
+    </w:p>
+    <w:p/>
+    <w:p>
+      <w:r>
+        <w:lastRenderedPageBreak/>
+        <w:t>Aankondiging nieuwe bestuurslid SRGA</w:t>
+      </w:r>
+    </w:p>
+    <w:p>
+      <w:pPr>
+        <w:jc w:val="both"/>
+      </w:pPr>
+      <w:r>
+        <w:t>Wij zijn God dankbaar dat wij een nieuw bestuurslid hebben gevonden voor de SRGA: br. Bart Cremers. Wij zijn dankbaar dat hij deze taak op zich wil nemen en bidden dat de Heer hem wijsheid en zegen zal schenken."</w:t>
+      </w:r>
+      <w:r>
+        <w:fldChar w:fldCharType="end"/>
+      </w:r>
+    </w:p>
+    <w:p>
+      <w:pPr>
+        <w:pStyle w:val="Heading2"/>
+      </w:pPr>
+    </w:p>
+    <w:p>
+      <w:pPr>
+        <w:pStyle w:val="Heading2"/>
+      </w:pPr>
+      <w:r>
+        <w:br w:type="column"/>
+      </w:r>
+      <w:r>
+        <w:t>Landelijke Mededelingen</w:t>
+      </w:r>
+    </w:p>
+    <w:p>
+      <w:pPr>
+        <w:jc w:val="both"/>
+      </w:pPr>
+      <w:r>
+        <w:fldChar w:fldCharType="begin"/>
+      </w:r>
+      <w:r>
+        <w:instrText xml:space="preserve"> LINK </w:instrText>
+      </w:r>
+      <w:r>
+        <w:instrText xml:space="preserve">Excel.Sheet.12 "/Users/vega/Library/CloudStorage/Dropbox/# Kerkbode GKIN Amstelveen/2026/Mededelingen Overzicht.xlsx" Output!R3C2 </w:instrText>
+      </w:r>
+      <w:r>
+        <w:instrText xml:space="preserve">\a \t  \* MERGEFORMAT </w:instrText>
+      </w:r>
+      <w:r>
+        <w:fldChar w:fldCharType="separate"/>
+      </w:r>
+      <w:r>
+        <w:t>"</w:t>
+      </w:r>
+      <w:proofErr w:type="gramStart"/>
+      <w:r>
+        <w:t>MKO ontvangsten</w:t>
+      </w:r>
+      <w:proofErr w:type="gramEnd"/>
+      <w:r>
+        <w:t xml:space="preserve"> t/m mei 2026</w:t>
+      </w:r>
+    </w:p>
+    <w:p>
+      <w:pPr>
+        <w:jc w:val="both"/>
+      </w:pPr>
+      <w:r>
+        <w:t xml:space="preserve">In vergelijking met vorig jaar mei 2025 zijn de </w:t>
+      </w:r>
+      <w:proofErr w:type="gramStart"/>
+      <w:r>
+        <w:t>MKO ontvangsten</w:t>
+      </w:r>
+      <w:proofErr w:type="gramEnd"/>
+      <w:r>
+        <w:t xml:space="preserve"> gedaald met 11%. We danken u hartelijk voor uw gaven en hopen op uw steun te mogen blijven rekenen. In het overzicht is ook de begroting per regio verwerkt en de actuele stand. Meer informatie over de begroting en </w:t>
+      </w:r>
+      <w:proofErr w:type="gramStart"/>
+      <w:r>
+        <w:t>MKO ontvangsten</w:t>
+      </w:r>
+      <w:proofErr w:type="gramEnd"/>
+      <w:r>
+        <w:t xml:space="preserve"> kunt u opvragen bij uw regionale kerkenraad. Bijgaand de </w:t>
+      </w:r>
+      <w:proofErr w:type="gramStart"/>
+      <w:r>
+        <w:t>MKO ontvangsten</w:t>
+      </w:r>
+      <w:proofErr w:type="gramEnd"/>
+      <w:r>
+        <w:t xml:space="preserve"> t/m mei 2026:</w:t>
+      </w:r>
+    </w:p>
+    <w:p>
+      <w:pPr>
+        <w:jc w:val="both"/>
+      </w:pPr>
+    </w:p>
+    <w:p>
+      <w:pPr>
+        <w:jc w:val="both"/>
+      </w:pPr>
+      <w:r>
+        <w:t>Bijgaand de begroting t/m april 2026:</w:t>
+      </w:r>
+    </w:p>
+    <w:p>
+      <w:pPr>
+        <w:jc w:val="both"/>
+      </w:pPr>
+    </w:p>
+    <w:p>
+      <w:pPr>
+        <w:jc w:val="both"/>
+      </w:pPr>
+      <w:r>
         <w:t>Overlijdensbericht</w:t>
       </w:r>
     </w:p>
     <w:p>
-      <w:r>
-        <w:t xml:space="preserve">Op woensdag 29 april 2026 is op 60-jarige leeftijd in Utrecht overleden, zr. Siang </w:t>
+      <w:pPr>
+        <w:jc w:val="both"/>
+      </w:pPr>
+      <w:r>
+        <w:t xml:space="preserve">Op dinsdag 23 juni 2026 is in Oegstgeest op 86-jarige leeftijd overleden zuster Tien </w:t>
       </w:r>
       <w:proofErr w:type="spellStart"/>
       <w:r>
-        <w:t>Lan</w:t>
+        <w:t>Nio</w:t>
       </w:r>
       <w:proofErr w:type="spellEnd"/>
       <w:r>
-        <w:t xml:space="preserve"> </w:t>
+        <w:t xml:space="preserve"> Maud </w:t>
       </w:r>
       <w:proofErr w:type="spellStart"/>
       <w:r>
-        <w:t>Goei</w:t>
+        <w:t>Tio</w:t>
       </w:r>
       <w:proofErr w:type="spellEnd"/>
       <w:r>
-        <w:t xml:space="preserve"> Grace van GKIN Amstelveen. De uitvaartdienst heeft plaatsgevonden op maandag 4 mei te Bussum.</w:t>
-      </w:r>
-    </w:p>
-    <w:p>
-      <w:r>
-        <w:t xml:space="preserve">Op woensdag 29 april 2026 is op 77-jarige leeftijd in </w:t>
+        <w:t xml:space="preserve"> - </w:t>
       </w:r>
       <w:proofErr w:type="spellStart"/>
       <w:r>
-        <w:t>Balige</w:t>
+        <w:t>Tjioe</w:t>
       </w:r>
       <w:proofErr w:type="spellEnd"/>
       <w:r>
-        <w:t xml:space="preserve">, Indonesië overleden, mevr. </w:t>
+        <w:t xml:space="preserve">, van regio Rijswijk-Den Haag. Zuster Maud </w:t>
       </w:r>
       <w:proofErr w:type="spellStart"/>
       <w:r>
-        <w:t>Loide</w:t>
+        <w:t>Tio</w:t>
       </w:r>
       <w:proofErr w:type="spellEnd"/>
       <w:r>
-        <w:t xml:space="preserve"> </w:t>
+        <w:t xml:space="preserve"> was in het verleden een toegewijde pianiste van GKIN.</w:t>
+      </w:r>
+    </w:p>
+    <w:p>
+      <w:pPr>
+        <w:jc w:val="both"/>
+      </w:pPr>
+      <w:r>
+        <w:t>De kerkenraad en gemeente van de GKIN wensen de nabestaanden Gods troost toe.</w:t>
+      </w:r>
+    </w:p>
+    <w:p>
+      <w:pPr>
+        <w:jc w:val="both"/>
+      </w:pPr>
+    </w:p>
+    <w:p>
+      <w:pPr>
+        <w:jc w:val="both"/>
+      </w:pPr>
+      <w:r>
+        <w:t xml:space="preserve">Aanstaande emeritaat van ds. </w:t>
       </w:r>
       <w:proofErr w:type="spellStart"/>
       <w:r>
-        <w:t>br</w:t>
+        <w:t>Tjahjadi</w:t>
       </w:r>
       <w:proofErr w:type="spellEnd"/>
-      <w:r>
-        <w:t xml:space="preserve"> </w:t>
+    </w:p>
+    <w:p>
+      <w:pPr>
+        <w:jc w:val="both"/>
+      </w:pPr>
+      <w:r>
+        <w:t xml:space="preserve">In verband met het aanstaande emeritaat van ds. </w:t>
       </w:r>
       <w:proofErr w:type="spellStart"/>
       <w:r>
-        <w:t>Manurung</w:t>
+        <w:t>Tjahjadi</w:t>
       </w:r>
       <w:proofErr w:type="spellEnd"/>
       <w:r>
-        <w:t xml:space="preserve"> (Op. </w:t>
+        <w:t xml:space="preserve"> dat in mei 2027 zal ingaan, zal hij zijn werkzaamheden vanaf juli 2026 geleidelijk afbouwen.</w:t>
+      </w:r>
+    </w:p>
+    <w:p>
+      <w:pPr>
+        <w:jc w:val="both"/>
+      </w:pPr>
+      <w:r>
+        <w:t xml:space="preserve">Betekent dit dat ds. </w:t>
       </w:r>
       <w:proofErr w:type="spellStart"/>
       <w:r>
-        <w:t>Othniel</w:t>
+        <w:t>Tjahjadi</w:t>
       </w:r>
       <w:proofErr w:type="spellEnd"/>
       <w:r>
-        <w:t xml:space="preserve"> </w:t>
-      </w:r>
-      <w:proofErr w:type="spellStart"/>
-      <w:r>
-        <w:t>Boru</w:t>
-      </w:r>
-      <w:proofErr w:type="spellEnd"/>
-      <w:r>
-        <w:t xml:space="preserve">). Zij was de moeder van zr. </w:t>
-      </w:r>
-      <w:proofErr w:type="spellStart"/>
-      <w:r>
-        <w:t>Lita</w:t>
-      </w:r>
-      <w:proofErr w:type="spellEnd"/>
-      <w:r>
-        <w:t xml:space="preserve"> </w:t>
-      </w:r>
-      <w:proofErr w:type="spellStart"/>
-      <w:r>
-        <w:t>Napitupulu</w:t>
-      </w:r>
-      <w:proofErr w:type="spellEnd"/>
-      <w:r>
-        <w:t xml:space="preserve">, schoonmoeder van br. Frederik </w:t>
-      </w:r>
-      <w:proofErr w:type="spellStart"/>
-      <w:r>
-        <w:t>Situmeang</w:t>
-      </w:r>
-      <w:proofErr w:type="spellEnd"/>
-      <w:r>
-        <w:t xml:space="preserve"> en grootmoeder van zr. </w:t>
-      </w:r>
-      <w:proofErr w:type="spellStart"/>
-      <w:r>
-        <w:t>Havila</w:t>
-      </w:r>
-      <w:proofErr w:type="spellEnd"/>
-      <w:r>
-        <w:t xml:space="preserve"> </w:t>
-      </w:r>
-      <w:proofErr w:type="spellStart"/>
-      <w:r>
-        <w:t>Situmeang</w:t>
-      </w:r>
-      <w:proofErr w:type="spellEnd"/>
-      <w:r>
-        <w:t xml:space="preserve"> van GKIN Amstelveen.</w:t>
-      </w:r>
-    </w:p>
-    <w:p>
-      <w:r>
-        <w:t>De gemeente en de kerkenraad bidden de familie in rouw Gods troost en nabijheid toe.</w:t>
-      </w:r>
-    </w:p>
-    <w:p/>
-    <w:p>
-      <w:r>
-        <w:t>Nieuwe leden in de seniorencommissie</w:t>
-      </w:r>
-    </w:p>
-    <w:p>
-      <w:r>
-        <w:t xml:space="preserve">Op zondag 17 mei 2026 zullen br. Bandung </w:t>
-      </w:r>
-      <w:proofErr w:type="spellStart"/>
-      <w:r>
-        <w:t>Nasserie</w:t>
-      </w:r>
-      <w:proofErr w:type="spellEnd"/>
-      <w:r>
-        <w:t xml:space="preserve"> als bestuurslid van de seniorencommissie (</w:t>
-      </w:r>
-      <w:proofErr w:type="gramStart"/>
-      <w:r>
-        <w:t>muziekafdeling)  worden</w:t>
-      </w:r>
-      <w:proofErr w:type="gramEnd"/>
-      <w:r>
-        <w:t xml:space="preserve"> geïnstalleerd tijdens de eredienst.</w:t>
-      </w:r>
-    </w:p>
-    <w:p>
-      <w:r>
-        <w:t>De gemeente en de kerkenraad wensen br. Bandung Gods onmisbare zegen toe in hun (nieuwe) bediening.</w:t>
-      </w:r>
-    </w:p>
-    <w:p/>
-    <w:p>
-      <w:r>
-        <w:t>Pinksterviering 2026</w:t>
-      </w:r>
-    </w:p>
-    <w:p>
-      <w:r>
-        <w:t>Wij nodigen u met grote vreugde uit om de Pinksterdienst 2026 bij te wonen. Op deze heilige dag vieren wij de uitstorting van de Heilige Geest. Dit is een moment van vreugde, vernieuwing en bezinning op Gods grootste gave aan ons: Zijn Geest die in ons woont en ons samenbrengt als gemeenschap.</w:t>
-      </w:r>
-    </w:p>
-    <w:p>
-      <w:r>
-        <w:lastRenderedPageBreak/>
-        <w:t>Het thema van dit jaar is ""Gemeenschap bouwen met een nieuwe geest en een nieuw hart"" (Ezechiël 11:19 en Handelingen 2:1–13).</w:t>
-      </w:r>
-    </w:p>
-    <w:p>
-      <w:r>
-        <w:t xml:space="preserve">De dienst wordt geleid door ds. </w:t>
-      </w:r>
-      <w:proofErr w:type="spellStart"/>
-      <w:r>
-        <w:t>Marla</w:t>
-      </w:r>
-      <w:proofErr w:type="spellEnd"/>
-      <w:r>
-        <w:t xml:space="preserve"> Winckler – </w:t>
-      </w:r>
-      <w:proofErr w:type="spellStart"/>
-      <w:r>
-        <w:t>Huliselan</w:t>
-      </w:r>
-      <w:proofErr w:type="spellEnd"/>
-      <w:r>
-        <w:t xml:space="preserve"> op zondag 24 mei 2026, beginnend om 10.30 uur in Bouwerij 52, 1185 XX Amstelveen.</w:t>
+        <w:t xml:space="preserve"> vanaf juli 2026 in de eerste week van elke maand geen diensten meer zal verzorgen.</w:t>
       </w:r>
     </w:p>
     <w:p>
@@ -1601,165 +1721,7 @@
         <w:jc w:val="both"/>
       </w:pPr>
       <w:r>
-        <w:t>Laten wij samenkomen in aanbidding, dankzegging en vreugde om de kracht van de Heilige Geest te vieren en om samen gemeenschap te bouwen met een nieuw hart. Jullie zijn allemaal van harte welkom bij deze Pinksterdienst!"</w:t>
-      </w:r>
-      <w:r>
-        <w:fldChar w:fldCharType="end"/>
-      </w:r>
-    </w:p>
-    <w:p>
-      <w:pPr>
-        <w:pStyle w:val="Heading2"/>
-      </w:pPr>
-    </w:p>
-    <w:p>
-      <w:pPr>
-        <w:pStyle w:val="Heading2"/>
-      </w:pPr>
-      <w:r>
-        <w:br w:type="column"/>
-      </w:r>
-      <w:r>
-        <w:t>Landelijke Mededelingen</w:t>
-      </w:r>
-    </w:p>
-    <w:p>
-      <w:pPr>
-        <w:jc w:val="both"/>
-      </w:pPr>
-      <w:r>
-        <w:fldChar w:fldCharType="begin"/>
-      </w:r>
-      <w:r>
-        <w:instrText xml:space="preserve"> LINK </w:instrText>
-      </w:r>
-      <w:r>
-        <w:instrText xml:space="preserve">Excel.Sheet.12 "/Users/vega/Library/CloudStorage/Dropbox/# Kerkbode GKIN Amstelveen/2026/Mededelingen Overzicht.xlsx" Output!R3C2 </w:instrText>
-      </w:r>
-      <w:r>
-        <w:instrText xml:space="preserve">\a \t  \* MERGEFORMAT </w:instrText>
-      </w:r>
-      <w:r>
-        <w:fldChar w:fldCharType="separate"/>
-      </w:r>
-      <w:r>
-        <w:t xml:space="preserve">"Geloofsbelijdenis </w:t>
-      </w:r>
-    </w:p>
-    <w:p>
-      <w:pPr>
-        <w:jc w:val="both"/>
-      </w:pPr>
-      <w:r>
-        <w:t xml:space="preserve">Op zondag 17 mei 2026 zal br. Bert Martin René </w:t>
-      </w:r>
-      <w:proofErr w:type="spellStart"/>
-      <w:r>
-        <w:t>Aper</w:t>
-      </w:r>
-      <w:proofErr w:type="spellEnd"/>
-      <w:r>
-        <w:t xml:space="preserve"> en zr </w:t>
-      </w:r>
-      <w:proofErr w:type="spellStart"/>
-      <w:r>
-        <w:t>Diah</w:t>
-      </w:r>
-      <w:proofErr w:type="spellEnd"/>
-      <w:r>
-        <w:t xml:space="preserve"> </w:t>
-      </w:r>
-      <w:proofErr w:type="spellStart"/>
-      <w:r>
-        <w:t>Sadiah</w:t>
-      </w:r>
-      <w:proofErr w:type="spellEnd"/>
-      <w:r>
-        <w:t xml:space="preserve"> de openbare Geloofsbelijdenis afleggen</w:t>
-      </w:r>
-    </w:p>
-    <w:p>
-      <w:pPr>
-        <w:jc w:val="both"/>
-      </w:pPr>
-      <w:proofErr w:type="gramStart"/>
-      <w:r>
-        <w:t>in</w:t>
-      </w:r>
-      <w:proofErr w:type="gramEnd"/>
-      <w:r>
-        <w:t xml:space="preserve"> de eredienst in de Marcuskerk te Den Haag onder leiding van ds. Stanley </w:t>
-      </w:r>
-      <w:proofErr w:type="spellStart"/>
-      <w:r>
-        <w:t>Tjahjadi</w:t>
-      </w:r>
-      <w:proofErr w:type="spellEnd"/>
-      <w:r>
-        <w:t>.</w:t>
-      </w:r>
-    </w:p>
-    <w:p>
-      <w:pPr>
-        <w:jc w:val="both"/>
-      </w:pPr>
-      <w:r>
-        <w:t xml:space="preserve">Gaarne uw voorbede voor deze bijzondere gelegenheid.  </w:t>
-      </w:r>
-    </w:p>
-    <w:p>
-      <w:pPr>
-        <w:jc w:val="both"/>
-      </w:pPr>
-    </w:p>
-    <w:p>
-      <w:pPr>
-        <w:jc w:val="both"/>
-      </w:pPr>
-      <w:r>
-        <w:t>GKIN regionale bijeenkomsten over basispastoraat</w:t>
-      </w:r>
-    </w:p>
-    <w:p>
-      <w:pPr>
-        <w:jc w:val="both"/>
-      </w:pPr>
-      <w:r>
-        <w:t>De komende maanden biedt GKIN regionale bijeenkomsten over basispastoraat aan alle gemeenteleden. Iedereen is immers bewust of onbewust betrokken bij pastorale ontmoetingen.</w:t>
-      </w:r>
-    </w:p>
-    <w:p>
-      <w:pPr>
-        <w:jc w:val="both"/>
-      </w:pPr>
-      <w:r>
-        <w:t>De bijeenkomst in regio Amstelveen vindt plaats op 21 juni, na de eredienst waarin ds. S.M. Winckler-</w:t>
-      </w:r>
-      <w:proofErr w:type="spellStart"/>
-      <w:r>
-        <w:t>Huliselan</w:t>
-      </w:r>
-      <w:proofErr w:type="spellEnd"/>
-      <w:r>
-        <w:t xml:space="preserve"> voorgaat. Samen met br. Bud </w:t>
-      </w:r>
-      <w:proofErr w:type="spellStart"/>
-      <w:r>
-        <w:t>Grüwel</w:t>
-      </w:r>
-      <w:proofErr w:type="spellEnd"/>
-      <w:r>
-        <w:t xml:space="preserve"> bespreekt zij de basis en kenmerken van eenvoudig en toegankelijk </w:t>
-      </w:r>
-      <w:proofErr w:type="spellStart"/>
-      <w:proofErr w:type="gramStart"/>
-      <w:r>
-        <w:t>pastoraat.Wij</w:t>
-      </w:r>
-      <w:proofErr w:type="spellEnd"/>
-      <w:proofErr w:type="gramEnd"/>
-      <w:r>
-        <w:t xml:space="preserve"> hopen jullie allemaal te ontmoeten, zodat GKIN samen een pastorale gemeente kan worden."</w:t>
+        <w:t>Wij zijn hem dankbaar voor zijn trouwe inzet en wensen hem Gods rijke zegen toe in deze nieuwe fase van zijn leven en bediening."</w:t>
       </w:r>
       <w:r>
         <w:fldChar w:fldCharType="end"/>
@@ -2053,12 +2015,6 @@
         <w:gridCol w:w="3255"/>
       </w:tblGrid>
       <w:tr>
-        <w:tblPrEx>
-          <w:tblCellMar>
-            <w:top w:w="0" w:type="dxa"/>
-            <w:bottom w:w="0" w:type="dxa"/>
-          </w:tblCellMar>
-        </w:tblPrEx>
         <w:trPr>
           <w:trHeight w:hRule="exact" w:val="255"/>
         </w:trPr>
@@ -2134,12 +2090,6 @@
         </w:tc>
       </w:tr>
       <w:tr>
-        <w:tblPrEx>
-          <w:tblCellMar>
-            <w:top w:w="0" w:type="dxa"/>
-            <w:bottom w:w="0" w:type="dxa"/>
-          </w:tblCellMar>
-        </w:tblPrEx>
         <w:trPr>
           <w:trHeight w:hRule="exact" w:val="255"/>
         </w:trPr>
@@ -2207,12 +2157,6 @@
         </w:tc>
       </w:tr>
       <w:tr>
-        <w:tblPrEx>
-          <w:tblCellMar>
-            <w:top w:w="0" w:type="dxa"/>
-            <w:bottom w:w="0" w:type="dxa"/>
-          </w:tblCellMar>
-        </w:tblPrEx>
         <w:trPr>
           <w:trHeight w:hRule="exact" w:val="255"/>
         </w:trPr>
@@ -2280,12 +2224,6 @@
         </w:tc>
       </w:tr>
       <w:tr>
-        <w:tblPrEx>
-          <w:tblCellMar>
-            <w:top w:w="0" w:type="dxa"/>
-            <w:bottom w:w="0" w:type="dxa"/>
-          </w:tblCellMar>
-        </w:tblPrEx>
         <w:trPr>
           <w:trHeight w:hRule="exact" w:val="255"/>
         </w:trPr>
@@ -2339,12 +2277,6 @@
         </w:tc>
       </w:tr>
       <w:tr>
-        <w:tblPrEx>
-          <w:tblCellMar>
-            <w:top w:w="0" w:type="dxa"/>
-            <w:bottom w:w="0" w:type="dxa"/>
-          </w:tblCellMar>
-        </w:tblPrEx>
         <w:trPr>
           <w:trHeight w:hRule="exact" w:val="255"/>
         </w:trPr>
@@ -2398,12 +2330,6 @@
         </w:tc>
       </w:tr>
       <w:tr>
-        <w:tblPrEx>
-          <w:tblCellMar>
-            <w:top w:w="0" w:type="dxa"/>
-            <w:bottom w:w="0" w:type="dxa"/>
-          </w:tblCellMar>
-        </w:tblPrEx>
         <w:trPr>
           <w:trHeight w:hRule="exact" w:val="255"/>
         </w:trPr>
@@ -2682,6 +2608,11 @@
           </w:tcPr>
           <w:p>
             <w:r>
+              <w:t>30/9-31/9</w:t>
+            </w:r>
+          </w:p>
+          <w:p>
+            <w:r>
               <w:t>24/9-29/9 29/10-30/10</w:t>
             </w:r>
           </w:p>
@@ -2735,7 +2666,13 @@
           </w:tcPr>
           <w:p>
             <w:r>
-              <w:t>13/10-28/10</w:t>
+              <w:t>13/10-2</w:t>
+            </w:r>
+            <w:r>
+              <w:t>9</w:t>
+            </w:r>
+            <w:r>
+              <w:t>/10</w:t>
             </w:r>
           </w:p>
         </w:tc>
@@ -3730,7 +3667,7 @@
 </file>
 
 <file path=word/numbering.xml><?xml version="1.0" encoding="utf-8"?>
-<w:numbering xmlns:wpc="http://schemas.microsoft.com/office/word/2010/wordprocessingCanvas" xmlns:cx="http://schemas.microsoft.com/office/drawing/2014/chartex" xmlns:cx1="http://schemas.microsoft.com/office/drawing/2015/9/8/chartex" xmlns:cx2="http://schemas.microsoft.com/office/drawing/2015/10/21/chartex" xmlns:cx3="http://schemas.microsoft.com/office/drawing/2016/5/9/chartex" xmlns:cx4="http://schemas.microsoft.com/office/drawing/2016/5/10/chartex" xmlns:cx5="http://schemas.microsoft.com/office/drawing/2016/5/11/chartex" xmlns:cx6="http://schemas.microsoft.com/office/drawing/2016/5/12/chartex" xmlns:cx7="http://schemas.microsoft.com/office/drawing/2016/5/13/chartex" xmlns:cx8="http://schemas.microsoft.com/office/drawing/2016/5/14/chartex" xmlns:mc="http://schemas.openxmlformats.org/markup-compatibility/2006" xmlns:aink="http://schemas.microsoft.com/office/drawing/2016/ink" xmlns:am3d="http://schemas.microsoft.com/office/drawing/2017/model3d" xmlns:o="urn:schemas-microsoft-com:office:office" xmlns:oel="http://schemas.microsoft.com/office/2019/extlst" xmlns:r="http://schemas.openxmlformats.org/officeDocument/2006/relationships" xmlns:m="http://schemas.openxmlformats.org/officeDocument/2006/math" xmlns:v="urn:schemas-microsoft-com:vml" xmlns:wp14="http://schemas.microsoft.com/office/word/2010/wordprocessingDrawing" xmlns:wp="http://schemas.openxmlformats.org/drawingml/2006/wordprocessingDrawing" xmlns:w10="urn:schemas-microsoft-com:office:word" xmlns:w="http://schemas.openxmlformats.org/wordprocessingml/2006/main" xmlns:w14="http://schemas.microsoft.com/office/word/2010/wordml" xmlns:w15="http://schemas.microsoft.com/office/word/2012/wordml" xmlns:w16cex="http://schemas.microsoft.com/office/word/2018/wordml/cex" xmlns:w16cid="http://schemas.microsoft.com/office/word/2016/wordml/cid" xmlns:w16="http://schemas.microsoft.com/office/word/2018/wordml" xmlns:w16du="http://schemas.microsoft.com/office/word/2023/wordml/word16du" xmlns:w16sdtdh="http://schemas.microsoft.com/office/word/2020/wordml/sdtdatahash" xmlns:w16sdtfl="http://schemas.microsoft.com/office/word/2024/wordml/sdtformatlock" xmlns:w16se="http://schemas.microsoft.com/office/word/2015/wordml/symex" xmlns:wpg="http://schemas.microsoft.com/office/word/2010/wordprocessingGroup" xmlns:wpi="http://schemas.microsoft.com/office/word/2010/wordprocessingInk" xmlns:wne="http://schemas.microsoft.com/office/word/2006/wordml" xmlns:wps="http://schemas.microsoft.com/office/word/2010/wordprocessingShape" mc:Ignorable="w14 w15 w16se w16cid w16 w16cex w16sdtdh w16sdtfl w16du wp14">
+<w:numbering xmlns:wpc="http://schemas.microsoft.com/office/word/2010/wordprocessingCanvas" xmlns:cx="http://schemas.microsoft.com/office/drawing/2014/chartex" xmlns:cx1="http://schemas.microsoft.com/office/drawing/2015/9/8/chartex" xmlns:cx2="http://schemas.microsoft.com/office/drawing/2015/10/21/chartex" xmlns:cx3="http://schemas.microsoft.com/office/drawing/2016/5/9/chartex" xmlns:cx4="http://schemas.microsoft.com/office/drawing/2016/5/10/chartex" xmlns:cx5="http://schemas.microsoft.com/office/drawing/2016/5/11/chartex" xmlns:cx6="http://schemas.microsoft.com/office/drawing/2016/5/12/chartex" xmlns:cx7="http://schemas.microsoft.com/office/drawing/2016/5/13/chartex" xmlns:cx8="http://schemas.microsoft.com/office/drawing/2016/5/14/chartex" xmlns:mc="http://schemas.openxmlformats.org/markup-compatibility/2006" xmlns:m="http://schemas.openxmlformats.org/officeDocument/2006/math" xmlns:aink="http://schemas.microsoft.com/office/drawing/2016/ink" xmlns:am3d="http://schemas.microsoft.com/office/drawing/2017/model3d" xmlns:oel="http://schemas.microsoft.com/office/2019/extlst" xmlns:r="http://schemas.openxmlformats.org/officeDocument/2006/relationships" xmlns:wp14="http://schemas.microsoft.com/office/word/2010/wordprocessingDrawing" xmlns:wp="http://schemas.openxmlformats.org/drawingml/2006/wordprocessingDrawing" xmlns:wpg="http://schemas.microsoft.com/office/word/2010/wordprocessingGroup" xmlns:wpi="http://schemas.microsoft.com/office/word/2010/wordprocessingInk" xmlns:wps="http://schemas.microsoft.com/office/word/2010/wordprocessingShape" xmlns:o="urn:schemas-microsoft-com:office:office" xmlns:v="urn:schemas-microsoft-com:vml" xmlns:w10="urn:schemas-microsoft-com:office:word" xmlns:w="http://schemas.openxmlformats.org/wordprocessingml/2006/main" xmlns:w14="http://schemas.microsoft.com/office/word/2010/wordml" xmlns:w15="http://schemas.microsoft.com/office/word/2012/wordml" xmlns:w16cex="http://schemas.microsoft.com/office/word/2018/wordml/cex" xmlns:w16cid="http://schemas.microsoft.com/office/word/2016/wordml/cid" xmlns:w16="http://schemas.microsoft.com/office/word/2018/wordml" xmlns:w16sdtdh="http://schemas.microsoft.com/office/word/2020/wordml/sdtdatahash" xmlns:w16sdtfl="http://schemas.microsoft.com/office/word/2024/wordml/sdtformatlock" xmlns:w16se="http://schemas.microsoft.com/office/word/2015/wordml/symex" xmlns:w16du="http://schemas.microsoft.com/office/word/2023/wordml/word16du" xmlns:wne="http://schemas.microsoft.com/office/word/2006/wordml" mc:Ignorable="w14 w15 w16se w16cid w16 w16cex w16sdtdh w16sdtfl w16du wp14">
   <w:abstractNum w:abstractNumId="0" w15:restartNumberingAfterBreak="0">
     <w:nsid w:val="1A3A505B"/>
     <w:multiLevelType w:val="hybridMultilevel"/>
@@ -4005,7 +3942,7 @@
 </file>
 
 <file path=word/styles.xml><?xml version="1.0" encoding="utf-8"?>
-<w:styles xmlns:mc="http://schemas.openxmlformats.org/markup-compatibility/2006" xmlns:r="http://schemas.openxmlformats.org/officeDocument/2006/relationships" xmlns:w="http://schemas.openxmlformats.org/wordprocessingml/2006/main" xmlns:w14="http://schemas.microsoft.com/office/word/2010/wordml" xmlns:w15="http://schemas.microsoft.com/office/word/2012/wordml" xmlns:w16cex="http://schemas.microsoft.com/office/word/2018/wordml/cex" xmlns:w16cid="http://schemas.microsoft.com/office/word/2016/wordml/cid" xmlns:w16="http://schemas.microsoft.com/office/word/2018/wordml" xmlns:w16du="http://schemas.microsoft.com/office/word/2023/wordml/word16du" xmlns:w16sdtdh="http://schemas.microsoft.com/office/word/2020/wordml/sdtdatahash" xmlns:w16sdtfl="http://schemas.microsoft.com/office/word/2024/wordml/sdtformatlock" xmlns:w16se="http://schemas.microsoft.com/office/word/2015/wordml/symex" mc:Ignorable="w14 w15 w16se w16cid w16 w16cex w16sdtdh w16sdtfl w16du">
+<w:styles xmlns:mc="http://schemas.openxmlformats.org/markup-compatibility/2006" xmlns:r="http://schemas.openxmlformats.org/officeDocument/2006/relationships" xmlns:w="http://schemas.openxmlformats.org/wordprocessingml/2006/main" xmlns:w14="http://schemas.microsoft.com/office/word/2010/wordml" xmlns:w15="http://schemas.microsoft.com/office/word/2012/wordml" xmlns:w16cex="http://schemas.microsoft.com/office/word/2018/wordml/cex" xmlns:w16cid="http://schemas.microsoft.com/office/word/2016/wordml/cid" xmlns:w16="http://schemas.microsoft.com/office/word/2018/wordml" xmlns:w16sdtdh="http://schemas.microsoft.com/office/word/2020/wordml/sdtdatahash" xmlns:w16sdtfl="http://schemas.microsoft.com/office/word/2024/wordml/sdtformatlock" xmlns:w16se="http://schemas.microsoft.com/office/word/2015/wordml/symex" xmlns:w16du="http://schemas.microsoft.com/office/word/2023/wordml/word16du" mc:Ignorable="w14 w15 w16se w16cid w16 w16cex w16sdtdh w16sdtfl w16du">
   <w:docDefaults>
     <w:rPrDefault>
       <w:rPr>
@@ -4622,6 +4559,7 @@
   <w:style w:type="character" w:default="1" w:styleId="DefaultParagraphFont">
     <w:name w:val="Default Paragraph Font"/>
     <w:uiPriority w:val="1"/>
+    <w:semiHidden/>
     <w:unhideWhenUsed/>
   </w:style>
   <w:style w:type="table" w:default="1" w:styleId="TableNormal">

</xml_diff>